<commit_message>
feat: update documentation and improve feature descriptions for clarity
</commit_message>
<xml_diff>
--- a/BRD_SDG_ESG_Platform.docx
+++ b/BRD_SDG_ESG_Platform.docx
@@ -45,7 +45,7 @@
           <w:sz w:val="24"/>
           <w:szCs w:val="24"/>
         </w:rPr>
-        <w:t xml:space="preserve">A SEDG-aligned sustainability disclosure platform for Malaysian SMEs</w:t>
+        <w:t xml:space="preserve">A SEDG-aligned sustainability disclosure &amp; reporting-operations platform for Malaysia</w:t>
       </w:r>
     </w:p>
     <w:p>
@@ -87,7 +87,7 @@
           <w:sz w:val="20"/>
           <w:szCs w:val="20"/>
         </w:rPr>
-        <w:t xml:space="preserve">Version 1.0 — July 2026</w:t>
+        <w:t xml:space="preserve">Version 1.1 — August 2026</w:t>
       </w:r>
     </w:p>
     <w:p>
@@ -275,7 +275,7 @@
                 <w:sz w:val="19"/>
                 <w:szCs w:val="19"/>
               </w:rPr>
-              <w:t xml:space="preserve">TBD (SDG/ESG SME Platform)</w:t>
+              <w:t xml:space="preserve">TBD (SDG/ESG Platform)</w:t>
             </w:r>
           </w:p>
         </w:tc>
@@ -325,7 +325,7 @@
                 <w:sz w:val="19"/>
                 <w:szCs w:val="19"/>
               </w:rPr>
-              <w:t xml:space="preserve">1.0</w:t>
+              <w:t xml:space="preserve">1.1</w:t>
             </w:r>
           </w:p>
         </w:tc>
@@ -375,7 +375,7 @@
                 <w:sz w:val="19"/>
                 <w:szCs w:val="19"/>
               </w:rPr>
-              <w:t xml:space="preserve">July 2026</w:t>
+              <w:t xml:space="preserve">August 2026</w:t>
             </w:r>
           </w:p>
         </w:tc>
@@ -476,6 +476,56 @@
                 <w:szCs w:val="19"/>
               </w:rPr>
               <w:t xml:space="preserve">Draft for validation</w:t>
+            </w:r>
+          </w:p>
+        </w:tc>
+      </w:tr>
+      <w:tr>
+        <w:tc>
+          <w:tcPr>
+            <w:tcW w:type="dxa" w:w="0"/>
+            <w:shd w:fill="FFFFFF" w:val="clear"/>
+            <w:tcMar>
+              <w:top w:type="dxa" w:w="80"/>
+              <w:left w:type="dxa" w:w="100"/>
+              <w:bottom w:type="dxa" w:w="80"/>
+              <w:right w:type="dxa" w:w="100"/>
+            </w:tcMar>
+          </w:tcPr>
+          <w:p>
+            <w:r>
+              <w:rPr>
+                <w:b w:val="false"/>
+                <w:bCs w:val="false"/>
+                <w:color w:val="222222"/>
+                <w:sz w:val="19"/>
+                <w:szCs w:val="19"/>
+              </w:rPr>
+              <w:t xml:space="preserve">Change Note</w:t>
+            </w:r>
+          </w:p>
+        </w:tc>
+        <w:tc>
+          <w:tcPr>
+            <w:tcW w:type="dxa" w:w="0"/>
+            <w:shd w:fill="FFFFFF" w:val="clear"/>
+            <w:tcMar>
+              <w:top w:type="dxa" w:w="80"/>
+              <w:left w:type="dxa" w:w="100"/>
+              <w:bottom w:type="dxa" w:w="80"/>
+              <w:right w:type="dxa" w:w="100"/>
+            </w:tcMar>
+          </w:tcPr>
+          <w:p>
+            <w:r>
+              <w:rPr>
+                <w:b w:val="false"/>
+                <w:bCs w:val="false"/>
+                <w:color w:val="222222"/>
+                <w:sz w:val="19"/>
+                <w:szCs w:val="19"/>
+              </w:rPr>
+              <w:t xml:space="preserve">v1.1 repositions the Issuer-Ready plan around reporting operations (data coordination, monthly tracking, audit trail) after confirming Bursa's CSI platform is the mandatory free compliance/calculation channel for listed issuers.</w:t>
             </w:r>
           </w:p>
         </w:tc>
@@ -512,7 +562,7 @@
           <w:sz w:val="21"/>
           <w:szCs w:val="21"/>
         </w:rPr>
-        <w:t xml:space="preserve">Malaysian SMEs sitting inside the supply chains of Bursa-listed issuers are facing mounting ESG disclosure pressure without the tooling, budget, or in-house expertise to respond. Capital Markets Malaysia's Simplified ESG Disclosure Guide (SEDG) gives this segment a standardised, regulator-endorsed framework, but adoption remains low because compliance is still manual — spreadsheets, PDFs, and ad hoc consultant engagements. This platform proposes a SaaS product that operationalises SEDG (and, by extension, Bursa Malaysia's Sustainability Reporting Guide indicator set) into a guided, tiered, software-driven workflow for SMEs, priced and scoped for a segment that larger enterprise ESG platforms do not efficiently serve.</w:t>
+        <w:t xml:space="preserve">Malaysian SMEs sitting inside the supply chains of Bursa-listed issuers are facing mounting ESG disclosure pressure without the tooling, budget, or in-house expertise to respond. Capital Markets Malaysia's Simplified ESG Disclosure Guide (SEDG) gives this segment a standardised, regulator-endorsed framework, but adoption remains low because compliance is still manual — spreadsheets, PDFs, and ad hoc consultant engagements. This platform proposes a SaaS product that operationalises SEDG into a guided, tiered, software-driven workflow for SMEs, priced and scoped for a segment that larger enterprise ESG platforms do not efficiently serve.</w:t>
       </w:r>
     </w:p>
     <w:p>
@@ -525,7 +575,20 @@
           <w:sz w:val="21"/>
           <w:szCs w:val="21"/>
         </w:rPr>
-        <w:t xml:space="preserve">The business opportunity rests on three converging forces: (1) regulatory cascade — large issuers must report Scope 3 and supply-chain ESG data, pushing the obligation down to SME suppliers; (2) commercial pressure — banks and GLC buyers increasingly use ESG data as a financing and tendering criterion; and (3) a documented capability gap — SMEs cite cost, complexity, and lack of guidance as the primary barriers to adoption, which is precisely what a well-designed SaaS product reduces.</w:t>
+        <w:t xml:space="preserve">For listed issuers, the opportunity is narrower and must be stated precisely. Bursa Malaysia's Centralised Sustainability Intelligence (CSI) platform is now the mandatory, free, official disclosure channel — it accepts final data directly from issuers, and even includes a free Scope 1/2 carbon calculator and Scope 3 estimation tool. A third-party product cannot compete with CSI as a compliance or calculation tool, and should not try to. What CSI does not provide is a year-round internal workspace: it is a single data-entry portal, not a coordination system for the finance, HR, EHS, and operations teams who each hold a piece of the required data across 9-11 sustainability matters. The Issuer-Ready plan is therefore positioned as a reporting operations layer — the internal system that collects, tracks, aggregates, and validates data monthly across departments so that the one annual CSI data-entry session takes an hour instead of weeks of chasing colleagues by email. This is a narrower, more defensible value proposition than "complete Bursa compliance," and the product should be built and marketed accordingly.</w:t>
+      </w:r>
+    </w:p>
+    <w:p>
+      <w:pPr>
+        <w:spacing w:after="160" w:line="276"/>
+      </w:pPr>
+      <w:r>
+        <w:rPr>
+          <w:color w:val="222222"/>
+          <w:sz w:val="21"/>
+          <w:szCs w:val="21"/>
+        </w:rPr>
+        <w:t xml:space="preserve">The business opportunity rests on three converging forces: (1) regulatory cascade — large issuers must report Scope 3 and supply-chain ESG data, pushing the obligation down to SME suppliers; (2) commercial pressure — banks and GLC buyers increasingly use ESG data as a financing and tendering criterion; and (3) a documented capability gap — SMEs cite cost, complexity, and lack of guidance as the primary barriers to adoption, which is precisely what a well-designed SaaS product reduces. For issuers specifically, the gap is internal coordination, not calculation or compliance know-how — CSI already covers the latter for free.</w:t>
       </w:r>
     </w:p>
     <w:p>
@@ -613,7 +676,25 @@
           <w:sz w:val="21"/>
           <w:szCs w:val="21"/>
         </w:rPr>
-        <w:t xml:space="preserve">Establish a data and workflow foundation (materiality assessment, governance documentation, multi-year indicator tracking) that can extend to adjacent segments — consultants/auditors and eventually larger issuers — without a full rebuild.</w:t>
+        <w:t xml:space="preserve">Establish a data and workflow foundation (materiality assessment, governance documentation, multi-year indicator tracking) that can extend to adjacent segments — consultants/auditors and eventually issuers — without a full rebuild.</w:t>
+      </w:r>
+    </w:p>
+    <w:p>
+      <w:pPr>
+        <w:pStyle w:val="ListParagraph"/>
+        <w:numPr>
+          <w:ilvl w:val="0"/>
+          <w:numId w:val="2"/>
+        </w:numPr>
+        <w:spacing w:after="80" w:line="270"/>
+      </w:pPr>
+      <w:r>
+        <w:rPr>
+          <w:color w:val="222222"/>
+          <w:sz w:val="21"/>
+          <w:szCs w:val="21"/>
+        </w:rPr>
+        <w:t xml:space="preserve">For the Issuer-Ready plan specifically, win on internal reporting-operations value (department coordination, monthly data collection, audit trail) rather than attempting to duplicate Bursa's free CSI compliance or calculation tools.</w:t>
       </w:r>
     </w:p>
     <w:p>
@@ -686,7 +767,7 @@
           <w:sz w:val="21"/>
           <w:szCs w:val="21"/>
         </w:rPr>
-        <w:t xml:space="preserve">On 23 December 2024, Bursa Malaysia amended its Main Market and ACE Market Listing Requirements to mandate IFRS S1/S2-aligned Sustainability Statements, replacing the guidance-based approach of the 3rd Edition Sustainability Reporting Guide. Phased rollout: Group 1 (market cap above RM2 billion) from FY2025, Group 2 (other Main Market) from FY2026, Group 3 (ACE Market) from FY2027, with 2 to 3 years of climate-first transition relief.</w:t>
+        <w:t xml:space="preserve">On 23 December 2024, Bursa Malaysia amended its Main Market and ACE Market Listing Requirements to mandate IFRS S1/S2-aligned Sustainability Statements. Phased rollout: Group 1 (market cap above RM2 billion) from FY2025, Group 2 (other Main Market) from FY2026, Group 3 (ACE Market) from FY2027, with 2 to 3 years of climate-first transition relief.</w:t>
       </w:r>
     </w:p>
     <w:p>
@@ -704,7 +785,7 @@
           <w:sz w:val="21"/>
           <w:szCs w:val="21"/>
         </w:rPr>
-        <w:t xml:space="preserve">Since 15 December 2025, listed issuers must generate their standardised sustainability disclosure summary through Bursa's own Centralised Sustainability Intelligence (CSI) platform and include it unmodified in their Sustainability Statement. CSI is provided free to issuers and is now the sole official reporting channel.</w:t>
+        <w:t xml:space="preserve">Since 15 December 2025, listed issuers must generate their standardised sustainability disclosure summary through Bursa's own Centralised Sustainability Intelligence (CSI) platform and include it unmodified in their Sustainability Statement. Access is granted on request (via csi@bursamalaysia.com), not self-serve, and is provided free. CSI replaced the older Bursa LINK system for this purpose.</w:t>
       </w:r>
     </w:p>
     <w:p>
@@ -722,7 +803,7 @@
           <w:sz w:val="21"/>
           <w:szCs w:val="21"/>
         </w:rPr>
-        <w:t xml:space="preserve">The Common Sustainability Matters were reduced from 11 to 9 for Main Market issuers; ACE Market issuers report 11 (the 9 common matters plus waste management and emissions).</w:t>
+        <w:t xml:space="preserve">CSI itself includes a free Scope 1/2 carbon calculator and a Scope 3 estimation tool (via FairSupply), plus an official "Value-Added Services" partner tier (e.g. CarbonGPT, SustenyX) offering AI-assisted reporting integrated directly with CSI. Any product strategy for issuers must account for this — CSI is not a passive data repository, it is an increasingly capable free tool in its own right.</w:t>
       </w:r>
     </w:p>
     <w:p>
@@ -740,23 +821,7 @@
           <w:sz w:val="21"/>
           <w:szCs w:val="21"/>
         </w:rPr>
-        <w:t xml:space="preserve">Simplified ESG Disclosure Guide (SEDG): launched by Capital Markets Malaysia in October 2023, remains the standardised voluntary framework for SMEs in supply chains, not superseded by the CSI/IFRS changes, which apply only to listed issuers and large non-listed companies.</w:t>
-      </w:r>
-    </w:p>
-    <w:p>
-      <w:pPr>
-        <w:pStyle w:val="Heading3"/>
-        <w:spacing w:after="100" w:before="200"/>
-      </w:pPr>
-      <w:r>
-        <w:rPr>
-          <w:b/>
-          <w:bCs/>
-          <w:color w:val="2E7D5B"/>
-          <w:sz w:val="21"/>
-          <w:szCs w:val="21"/>
-        </w:rPr>
-        <w:t xml:space="preserve">4.2 Commercial drivers</w:t>
+        <w:t xml:space="preserve">The Common Sustainability Matters were reduced from 11 to 9 for Main Market issuers; ACE Market issuers report 11 (the 9 common matters plus waste management and emissions).</w:t>
       </w:r>
     </w:p>
     <w:p>
@@ -774,7 +839,23 @@
           <w:sz w:val="21"/>
           <w:szCs w:val="21"/>
         </w:rPr>
-        <w:t xml:space="preserve">Bank Negara climate risk guidelines are pushing banks to score SME borrowers on ESG controls, affecting loan terms.</w:t>
+        <w:t xml:space="preserve">Simplified ESG Disclosure Guide (SEDG): launched by Capital Markets Malaysia in October 2023, remains the standardised voluntary framework for SMEs in supply chains, not superseded by the CSI/IFRS changes, which apply only to listed issuers and large non-listed companies.</w:t>
+      </w:r>
+    </w:p>
+    <w:p>
+      <w:pPr>
+        <w:pStyle w:val="Heading3"/>
+        <w:spacing w:after="100" w:before="200"/>
+      </w:pPr>
+      <w:r>
+        <w:rPr>
+          <w:b/>
+          <w:bCs/>
+          <w:color w:val="2E7D5B"/>
+          <w:sz w:val="21"/>
+          <w:szCs w:val="21"/>
+        </w:rPr>
+        <w:t xml:space="preserve">4.2 Commercial drivers</w:t>
       </w:r>
     </w:p>
     <w:p>
@@ -792,6 +873,24 @@
           <w:sz w:val="21"/>
           <w:szCs w:val="21"/>
         </w:rPr>
+        <w:t xml:space="preserve">Bank Negara climate risk guidelines are pushing banks to score SME borrowers on ESG controls, affecting loan terms.</w:t>
+      </w:r>
+    </w:p>
+    <w:p>
+      <w:pPr>
+        <w:pStyle w:val="ListParagraph"/>
+        <w:numPr>
+          <w:ilvl w:val="0"/>
+          <w:numId w:val="3"/>
+        </w:numPr>
+        <w:spacing w:after="80" w:line="270"/>
+      </w:pPr>
+      <w:r>
+        <w:rPr>
+          <w:color w:val="222222"/>
+          <w:sz w:val="21"/>
+          <w:szCs w:val="21"/>
+        </w:rPr>
         <w:t xml:space="preserve">GLC and MNC buyers (e.g. utilities, telcos, large manufacturers) are using ESG compliance as a tender tie-breaker, and increasingly need supplier-level Scope 3 data to satisfy their own IFRS S2 disclosures.</w:t>
       </w:r>
     </w:p>
@@ -821,7 +920,7 @@
           <w:sz w:val="21"/>
           <w:szCs w:val="21"/>
         </w:rPr>
-        <w:t xml:space="preserve">Because Bursa's CSI platform is now the mandatory, free, sole reporting channel for listed issuers, a third-party platform cannot replace or compete with it as the compliance channel of record for that segment. The viable product strategy is therefore twofold: (1) a full-featured disclosure tool for SMEs and large non-listed companies, the segment CSI does not serve, and (2) for listed issuers, a reporting-readiness and data-management layer that prepares, tracks, and validates data before it is entered into CSI, not a replacement for CSI itself.</w:t>
+        <w:t xml:space="preserve">Because CSI is free, official, and increasingly full-featured (including calculation tools and an official partner program), a third-party platform cannot and should not compete with it on compliance or calculation for listed issuers. Data entry into CSI itself is manual and happens directly inside Bursa's platform — no third-party system pushes data into CSI automatically outside the official Value-Added Services partner program. The viable product strategy for this segment is therefore narrow and specific: be the internal system of record that coordinates data collection across departments throughout the year, so the final manual CSI entry session is fast and accurate, not a system that claims to calculate emissions or replace compliance judgment.</w:t>
       </w:r>
     </w:p>
     <w:p>
@@ -850,7 +949,7 @@
           <w:sz w:val="21"/>
           <w:szCs w:val="21"/>
         </w:rPr>
-        <w:t xml:space="preserve">Industry research shows that while a majority of SME ESG adopters recognise its value, non-adopters cite three consistent barriers: uncertainty about tangible impact, limited technical knowledge, and high implementation cost. A guided, tiered SaaS product directly addresses all three.</w:t>
+        <w:t xml:space="preserve">Industry research shows that while a majority of SME ESG adopters recognise its value, non-adopters cite three consistent barriers: uncertainty about tangible impact, limited technical knowledge, and high implementation cost. A guided, tiered SaaS product directly addresses all three. For issuers, the analogous barrier is internal coordination overhead, not lack of a compliance channel — CSI already solved that part.</w:t>
       </w:r>
     </w:p>
     <w:p>
@@ -882,8 +981,8 @@
         </w:tblBorders>
       </w:tblPr>
       <w:tblGrid>
-        <w:gridCol w:w="3600"/>
-        <w:gridCol w:w="5900"/>
+        <w:gridCol w:w="4200"/>
+        <w:gridCol w:w="5300"/>
       </w:tblGrid>
       <w:tr>
         <w:trPr>
@@ -1059,6 +1158,106 @@
                 <w:sz w:val="19"/>
                 <w:szCs w:val="19"/>
               </w:rPr>
+              <w:t xml:space="preserve">Issuer sustainability manager</w:t>
+            </w:r>
+          </w:p>
+        </w:tc>
+        <w:tc>
+          <w:tcPr>
+            <w:tcW w:type="dxa" w:w="0"/>
+            <w:shd w:fill="FFFFFF" w:val="clear"/>
+            <w:tcMar>
+              <w:top w:type="dxa" w:w="80"/>
+              <w:left w:type="dxa" w:w="100"/>
+              <w:bottom w:type="dxa" w:w="80"/>
+              <w:right w:type="dxa" w:w="100"/>
+            </w:tcMar>
+          </w:tcPr>
+          <w:p>
+            <w:r>
+              <w:rPr>
+                <w:b w:val="false"/>
+                <w:bCs w:val="false"/>
+                <w:color w:val="222222"/>
+                <w:sz w:val="19"/>
+                <w:szCs w:val="19"/>
+              </w:rPr>
+              <w:t xml:space="preserve">Coordinates data collection across departments; final data entered into CSI by this person or their team</w:t>
+            </w:r>
+          </w:p>
+        </w:tc>
+      </w:tr>
+      <w:tr>
+        <w:tc>
+          <w:tcPr>
+            <w:tcW w:type="dxa" w:w="0"/>
+            <w:shd w:fill="FFFFFF" w:val="clear"/>
+            <w:tcMar>
+              <w:top w:type="dxa" w:w="80"/>
+              <w:left w:type="dxa" w:w="100"/>
+              <w:bottom w:type="dxa" w:w="80"/>
+              <w:right w:type="dxa" w:w="100"/>
+            </w:tcMar>
+          </w:tcPr>
+          <w:p>
+            <w:r>
+              <w:rPr>
+                <w:b w:val="false"/>
+                <w:bCs w:val="false"/>
+                <w:color w:val="222222"/>
+                <w:sz w:val="19"/>
+                <w:szCs w:val="19"/>
+              </w:rPr>
+              <w:t xml:space="preserve">Issuer departmental contributors (HR, EHS, finance, ops)</w:t>
+            </w:r>
+          </w:p>
+        </w:tc>
+        <w:tc>
+          <w:tcPr>
+            <w:tcW w:type="dxa" w:w="0"/>
+            <w:shd w:fill="FFFFFF" w:val="clear"/>
+            <w:tcMar>
+              <w:top w:type="dxa" w:w="80"/>
+              <w:left w:type="dxa" w:w="100"/>
+              <w:bottom w:type="dxa" w:w="80"/>
+              <w:right w:type="dxa" w:w="100"/>
+            </w:tcMar>
+          </w:tcPr>
+          <w:p>
+            <w:r>
+              <w:rPr>
+                <w:b w:val="false"/>
+                <w:bCs w:val="false"/>
+                <w:color w:val="222222"/>
+                <w:sz w:val="19"/>
+                <w:szCs w:val="19"/>
+              </w:rPr>
+              <w:t xml:space="preserve">Each holds a piece of the required data; currently coordinated by email/spreadsheet</w:t>
+            </w:r>
+          </w:p>
+        </w:tc>
+      </w:tr>
+      <w:tr>
+        <w:tc>
+          <w:tcPr>
+            <w:tcW w:type="dxa" w:w="0"/>
+            <w:shd w:fill="FFFFFF" w:val="clear"/>
+            <w:tcMar>
+              <w:top w:type="dxa" w:w="80"/>
+              <w:left w:type="dxa" w:w="100"/>
+              <w:bottom w:type="dxa" w:w="80"/>
+              <w:right w:type="dxa" w:w="100"/>
+            </w:tcMar>
+          </w:tcPr>
+          <w:p>
+            <w:r>
+              <w:rPr>
+                <w:b w:val="false"/>
+                <w:bCs w:val="false"/>
+                <w:color w:val="222222"/>
+                <w:sz w:val="19"/>
+                <w:szCs w:val="19"/>
+              </w:rPr>
               <w:t xml:space="preserve">Large issuer / buyer (data requester)</w:t>
             </w:r>
           </w:p>
@@ -1265,7 +1464,7 @@
           <w:sz w:val="21"/>
           <w:szCs w:val="21"/>
         </w:rPr>
-        <w:t xml:space="preserve">To reconcile "complete coverage of Bursa's requirements" with a realistic solo-build roadmap, the platform is structured as a single product with three plans. Each plan is fully-featured for its target company profile rather than being an artificially crippled version of the next tier — this keeps the product honest about what each customer actually needs.</w:t>
+        <w:t xml:space="preserve">To reconcile a realistic solo-build roadmap with an honest read of what a third-party platform can add on top of Bursa's free, mandatory CSI channel, the platform is structured as a single product with three plans. Starter and Growth remain SME-focused disclosure tools. Issuer-Ready is repositioned around reporting operations rather than compliance or calculation.</w:t>
       </w:r>
     </w:p>
     <w:p>
@@ -1465,7 +1664,7 @@
           <w:sz w:val="21"/>
           <w:szCs w:val="21"/>
         </w:rPr>
-        <w:t xml:space="preserve">6.3 Plan 3 — Issuer-Ready (Complete Bursa/IFRS coverage)</w:t>
+        <w:t xml:space="preserve">6.3 Plan 3 — Issuer-Ready (Reporting Operations Layer)</w:t>
       </w:r>
     </w:p>
     <w:p>
@@ -1478,7 +1677,7 @@
           <w:sz w:val="21"/>
           <w:szCs w:val="21"/>
         </w:rPr>
-        <w:t xml:space="preserve">Target: Main Market and ACE Market listed issuers, and large non-listed companies in NSRF scope, who need a data-management and readiness layer before submitting through Bursa's mandatory CSI platform.</w:t>
+        <w:t xml:space="preserve">Target: Main Market and ACE Market listed issuers, and large non-listed companies in NSRF scope, who need to coordinate multi-department ESG data collection ahead of their team's manual CSI submission. This plan does not attempt to replace, calculate for, or duplicate CSI's free tools.</w:t>
       </w:r>
     </w:p>
     <w:p>
@@ -1496,7 +1695,7 @@
           <w:sz w:val="21"/>
           <w:szCs w:val="21"/>
         </w:rPr>
-        <w:t xml:space="preserve">Correct Common Sustainability Matters set applied by market: 9 matters for Main Market, 11 for ACE Market (9 plus waste and emissions).</w:t>
+        <w:t xml:space="preserve">Multi-department coordination workflow: assign each sustainability matter or indicator to a named departmental contributor (HR, EHS, finance, ops), track submission status per contributor, and send reminders — this is the core differentiator and the primary reason to buy.</w:t>
       </w:r>
     </w:p>
     <w:p>
@@ -1514,7 +1713,7 @@
           <w:sz w:val="21"/>
           <w:szCs w:val="21"/>
         </w:rPr>
-        <w:t xml:space="preserve">IFRS S1 (general sustainability-related risks/opportunities) and IFRS S2 (climate: governance, strategy, risk management, metrics and targets) structured data capture, replacing the old standalone TCFD module now that TCFD-aligned disclosure has been formally absorbed into IFRS S2.</w:t>
+        <w:t xml:space="preserve">Monthly data collection with automatic annual aggregation, so no one department has to backfill a year of figures manually before the CSI entry session.</w:t>
       </w:r>
     </w:p>
     <w:p>
@@ -1532,7 +1731,7 @@
           <w:sz w:val="21"/>
           <w:szCs w:val="21"/>
         </w:rPr>
-        <w:t xml:space="preserve">Full Scope 1, 2, and 3 GHG emissions tracking, with support for the climate-first transition relief (2 years Main Market, 3 years ACE Market) and principal-segment scoping.</w:t>
+        <w:t xml:space="preserve">Correct Common Sustainability Matters set applied by market (9 for Main Market, 11 for ACE Market) used purely as the internal data-collection checklist — not a compliance calculation engine.</w:t>
       </w:r>
     </w:p>
     <w:p>
@@ -1550,7 +1749,7 @@
           <w:sz w:val="21"/>
           <w:szCs w:val="21"/>
         </w:rPr>
-        <w:t xml:space="preserve">Assurance-readiness workflow: structured audit trail, internal review sign-off, and export formats aligned to what external assurance providers require, in preparation for mandatory reasonable assurance on Scope 1/2.</w:t>
+        <w:t xml:space="preserve">Materiality assessment and governance documentation — upstream work CSI does not provide tooling for at all.</w:t>
       </w:r>
     </w:p>
     <w:p>
@@ -1568,7 +1767,7 @@
           <w:sz w:val="21"/>
           <w:szCs w:val="21"/>
         </w:rPr>
-        <w:t xml:space="preserve">CSI-compatible export: output structured to match Bursa's CSI data requirements, so an issuer's sustainability team can review, validate, and finalise data in this platform, then transfer it into CSI for official submission. This platform is explicitly a pre-CSI readiness layer, not a replacement for CSI.</w:t>
+        <w:t xml:space="preserve">Structured internal audit trail (who entered what, when, source documents) so the person doing final CSI entry — and any external assurance provider — can see how each figure was built, not just trust a typed-in total.</w:t>
       </w:r>
     </w:p>
     <w:p>
@@ -1586,7 +1785,7 @@
           <w:sz w:val="21"/>
           <w:szCs w:val="21"/>
         </w:rPr>
-        <w:t xml:space="preserve">Multi-sector indicator coverage across Bursa's sector classifications, not limited to a single pilot sector.</w:t>
+        <w:t xml:space="preserve">CSI-structure-matching export: a checklist-style output organised to match what CSI will ask for, to make the manual CSI entry session faster and less error-prone. Explicitly not a calculation tool and not a submission mechanism.</w:t>
       </w:r>
     </w:p>
     <w:p>
@@ -1602,7 +1801,7 @@
           <w:sz w:val="21"/>
           <w:szCs w:val="21"/>
         </w:rPr>
-        <w:t xml:space="preserve">6.4 Out of scope (all plans, Phase 1 build)</w:t>
+        <w:t xml:space="preserve">6.4 Out of scope (all plans)</w:t>
       </w:r>
     </w:p>
     <w:p>
@@ -1620,7 +1819,7 @@
           <w:sz w:val="21"/>
           <w:szCs w:val="21"/>
         </w:rPr>
-        <w:t xml:space="preserve">Direct API integration with Bursa's CSI platform (no public integration channel currently documented; revisit if Bursa publishes one).</w:t>
+        <w:t xml:space="preserve">Any GHG emissions calculator or Scope 3 estimation logic — CSI already provides this free via its own Scope 1/2 calculator and FairSupply-based Scope 3 estimation; duplicating it adds no value and creates a support/liability burden with no upside.</w:t>
       </w:r>
     </w:p>
     <w:p>
@@ -1638,7 +1837,7 @@
           <w:sz w:val="21"/>
           <w:szCs w:val="21"/>
         </w:rPr>
-        <w:t xml:space="preserve">Multi-entity consolidation for corporate groups — later phase within the Issuer-Ready plan.</w:t>
+        <w:t xml:space="preserve">Direct API integration with Bursa's CSI platform — no public integration channel exists outside the official Value-Added Services partner program, which is a possible future path, not a Phase 1 assumption.</w:t>
       </w:r>
     </w:p>
     <w:p>
@@ -1656,7 +1855,43 @@
           <w:sz w:val="21"/>
           <w:szCs w:val="21"/>
         </w:rPr>
-        <w:t xml:space="preserve">XBRL or other regulator-specific data tagging beyond CSI-compatible export formatting.</w:t>
+        <w:t xml:space="preserve">Multi-entity consolidation for corporate groups — later phase within the Issuer-Ready plan.</w:t>
+      </w:r>
+    </w:p>
+    <w:p>
+      <w:pPr>
+        <w:pStyle w:val="ListParagraph"/>
+        <w:numPr>
+          <w:ilvl w:val="0"/>
+          <w:numId w:val="3"/>
+        </w:numPr>
+        <w:spacing w:after="80" w:line="270"/>
+      </w:pPr>
+      <w:r>
+        <w:rPr>
+          <w:color w:val="222222"/>
+          <w:sz w:val="21"/>
+          <w:szCs w:val="21"/>
+        </w:rPr>
+        <w:t xml:space="preserve">XBRL or other regulator-specific data tagging.</w:t>
+      </w:r>
+    </w:p>
+    <w:p>
+      <w:pPr>
+        <w:pStyle w:val="ListParagraph"/>
+        <w:numPr>
+          <w:ilvl w:val="0"/>
+          <w:numId w:val="3"/>
+        </w:numPr>
+        <w:spacing w:after="80" w:line="270"/>
+      </w:pPr>
+      <w:r>
+        <w:rPr>
+          <w:color w:val="222222"/>
+          <w:sz w:val="21"/>
+          <w:szCs w:val="21"/>
+        </w:rPr>
+        <w:t xml:space="preserve">Formal third-party assurance itself — the platform prepares assurance-ready documentation but does not replace a licensed assurance provider.</w:t>
       </w:r>
     </w:p>
     <w:p>
@@ -1689,9 +1924,9 @@
       </w:tblPr>
       <w:tblGrid>
         <w:gridCol w:w="1100"/>
-        <w:gridCol w:w="5400"/>
+        <w:gridCol w:w="5300"/>
         <w:gridCol w:w="1700"/>
-        <w:gridCol w:w="1300"/>
+        <w:gridCol w:w="1400"/>
       </w:tblGrid>
       <w:tr>
         <w:trPr>
@@ -2035,31 +2270,31 @@
                 <w:sz w:val="19"/>
                 <w:szCs w:val="19"/>
               </w:rPr>
-              <w:t xml:space="preserve">The platform must store at least 3 financial years of indicator data per company to support trend and target comparison.</w:t>
-            </w:r>
-          </w:p>
-        </w:tc>
-        <w:tc>
-          <w:tcPr>
-            <w:tcW w:type="dxa" w:w="0"/>
-            <w:shd w:fill="FFFFFF" w:val="clear"/>
-            <w:tcMar>
-              <w:top w:type="dxa" w:w="80"/>
-              <w:left w:type="dxa" w:w="100"/>
-              <w:bottom w:type="dxa" w:w="80"/>
-              <w:right w:type="dxa" w:w="100"/>
-            </w:tcMar>
-          </w:tcPr>
-          <w:p>
-            <w:r>
-              <w:rPr>
-                <w:b w:val="false"/>
-                <w:bCs w:val="false"/>
-                <w:color w:val="222222"/>
-                <w:sz w:val="19"/>
-                <w:szCs w:val="19"/>
-              </w:rPr>
-              <w:t xml:space="preserve">Growth, Issuer-Ready</w:t>
+              <w:t xml:space="preserve">The platform must allow monthly data entry with automatic annual aggregation, so no user manually totals figures before reporting.</w:t>
+            </w:r>
+          </w:p>
+        </w:tc>
+        <w:tc>
+          <w:tcPr>
+            <w:tcW w:type="dxa" w:w="0"/>
+            <w:shd w:fill="FFFFFF" w:val="clear"/>
+            <w:tcMar>
+              <w:top w:type="dxa" w:w="80"/>
+              <w:left w:type="dxa" w:w="100"/>
+              <w:bottom w:type="dxa" w:w="80"/>
+              <w:right w:type="dxa" w:w="100"/>
+            </w:tcMar>
+          </w:tcPr>
+          <w:p>
+            <w:r>
+              <w:rPr>
+                <w:b w:val="false"/>
+                <w:bCs w:val="false"/>
+                <w:color w:val="222222"/>
+                <w:sz w:val="19"/>
+                <w:szCs w:val="19"/>
+              </w:rPr>
+              <w:t xml:space="preserve">All (Growth/Issuer-Ready primary)</w:t>
             </w:r>
           </w:p>
         </w:tc>
@@ -2231,7 +2466,7 @@
                 <w:sz w:val="19"/>
                 <w:szCs w:val="19"/>
               </w:rPr>
-              <w:t xml:space="preserve">The platform must produce an exportable disclosure summary suitable for buyer, bank, or auditor requests.</w:t>
+              <w:t xml:space="preserve">The platform must produce an exportable disclosure summary suitable for buyer, bank, or auditor requests, and, for Issuer-Ready, a checklist-style export matching CSI's data structure.</w:t>
             </w:r>
           </w:p>
         </w:tc>
@@ -2427,7 +2662,7 @@
                 <w:sz w:val="19"/>
                 <w:szCs w:val="19"/>
               </w:rPr>
-              <w:t xml:space="preserve">The Issuer-Ready plan must support IFRS S1 and IFRS S2 structured data capture, including full Scope 1/2/3 emissions and climate-first transition relief handling.</w:t>
+              <w:t xml:space="preserve">The Issuer-Ready plan must support a multi-department coordination workflow: assign matters/indicators to named contributors, track per-contributor submission status, and send reminders. This is the plan's primary value driver.</w:t>
             </w:r>
           </w:p>
         </w:tc>
@@ -2525,7 +2760,7 @@
                 <w:sz w:val="19"/>
                 <w:szCs w:val="19"/>
               </w:rPr>
-              <w:t xml:space="preserve">The Issuer-Ready plan must produce a CSI-compatible export format so issuer teams can validate data before manual transfer into Bursa's CSI platform.</w:t>
+              <w:t xml:space="preserve">The Issuer-Ready plan must not include any GHG emissions calculation or estimation logic — it collects and organises data supplied by the company, and defers all calculation to CSI's free tools.</w:t>
             </w:r>
           </w:p>
         </w:tc>
@@ -2573,7 +2808,7 @@
                 <w:sz w:val="19"/>
                 <w:szCs w:val="19"/>
               </w:rPr>
-              <w:t xml:space="preserve">Must</w:t>
+              <w:t xml:space="preserve">Must (constraint)</w:t>
             </w:r>
           </w:p>
         </w:tc>
@@ -2940,7 +3175,7 @@
           <w:sz w:val="21"/>
           <w:szCs w:val="21"/>
         </w:rPr>
-        <w:t xml:space="preserve">Initial customer acquisition will rely on direct outreach and possibly partnerships with SME associations or banks, not paid marketing at scale.</w:t>
+        <w:t xml:space="preserve">Issuers experience real internal coordination pain (multiple departments, no shared system) that is independent of, and not solved by, CSI itself — this should be validated directly with a design-partner issuer before Issuer-Ready development begins.</w:t>
       </w:r>
     </w:p>
     <w:p>
@@ -2958,23 +3193,7 @@
           <w:sz w:val="21"/>
           <w:szCs w:val="21"/>
         </w:rPr>
-        <w:t xml:space="preserve">The founder will operate solo, part-time, through at least the MVP and early validation phase.</w:t>
-      </w:r>
-    </w:p>
-    <w:p>
-      <w:pPr>
-        <w:pStyle w:val="Heading1"/>
-        <w:spacing w:after="200" w:before="400"/>
-      </w:pPr>
-      <w:r>
-        <w:rPr>
-          <w:b/>
-          <w:bCs/>
-          <w:color w:val="1F3A5F"/>
-          <w:sz w:val="30"/>
-          <w:szCs w:val="30"/>
-        </w:rPr>
-        <w:t xml:space="preserve">9. Constraints</w:t>
+        <w:t xml:space="preserve">Initial customer acquisition will rely on direct outreach and possibly partnerships with SME associations or banks, not paid marketing at scale.</w:t>
       </w:r>
     </w:p>
     <w:p>
@@ -2992,7 +3211,23 @@
           <w:sz w:val="21"/>
           <w:szCs w:val="21"/>
         </w:rPr>
-        <w:t xml:space="preserve">Solo, nights-and-weekends development capacity limits the pace of feature delivery and customer support responsiveness.</w:t>
+        <w:t xml:space="preserve">The founder will operate solo, part-time, through at least the MVP and early validation phase.</w:t>
+      </w:r>
+    </w:p>
+    <w:p>
+      <w:pPr>
+        <w:pStyle w:val="Heading1"/>
+        <w:spacing w:after="200" w:before="400"/>
+      </w:pPr>
+      <w:r>
+        <w:rPr>
+          <w:b/>
+          <w:bCs/>
+          <w:color w:val="1F3A5F"/>
+          <w:sz w:val="30"/>
+          <w:szCs w:val="30"/>
+        </w:rPr>
+        <w:t xml:space="preserve">9. Constraints</w:t>
       </w:r>
     </w:p>
     <w:p>
@@ -3010,7 +3245,7 @@
           <w:sz w:val="21"/>
           <w:szCs w:val="21"/>
         </w:rPr>
-        <w:t xml:space="preserve">No existing brand recognition or distribution channel in the ESG/sustainability space.</w:t>
+        <w:t xml:space="preserve">Solo, nights-and-weekends development capacity limits the pace of feature delivery and customer support responsiveness.</w:t>
       </w:r>
     </w:p>
     <w:p>
@@ -3028,7 +3263,25 @@
           <w:sz w:val="21"/>
           <w:szCs w:val="21"/>
         </w:rPr>
-        <w:t xml:space="preserve">Regulatory frameworks (NSRF, SEDG) are still evolving; product must be built to accommodate indicator or framework changes without a full rebuild.</w:t>
+        <w:t xml:space="preserve">No existing brand recognition or distribution channel in the ESG/sustainability space.</w:t>
+      </w:r>
+    </w:p>
+    <w:p>
+      <w:pPr>
+        <w:pStyle w:val="ListParagraph"/>
+        <w:numPr>
+          <w:ilvl w:val="0"/>
+          <w:numId w:val="3"/>
+        </w:numPr>
+        <w:spacing w:after="80" w:line="270"/>
+      </w:pPr>
+      <w:r>
+        <w:rPr>
+          <w:color w:val="222222"/>
+          <w:sz w:val="21"/>
+          <w:szCs w:val="21"/>
+        </w:rPr>
+        <w:t xml:space="preserve">Regulatory frameworks (NSRF, SEDG, CSI) are still evolving and CSI's own feature set is actively expanding (e.g. the December 2025 enhanced prescribed format) — the product must be built to avoid duplicating whatever CSI adds next, which means re-checking CSI's feature set periodically, not just at initial build.</w:t>
       </w:r>
     </w:p>
     <w:p>
@@ -3078,9 +3331,9 @@
         </w:tblBorders>
       </w:tblPr>
       <w:tblGrid>
-        <w:gridCol w:w="3000"/>
-        <w:gridCol w:w="1400"/>
-        <w:gridCol w:w="4100"/>
+        <w:gridCol w:w="3400"/>
+        <w:gridCol w:w="1200"/>
+        <w:gridCol w:w="3900"/>
       </w:tblGrid>
       <w:tr>
         <w:trPr>
@@ -3229,6 +3482,80 @@
                 <w:szCs w:val="19"/>
               </w:rPr>
               <w:t xml:space="preserve">Price low at Basic tier; lead with free materiality assessment as an acquisition hook</w:t>
+            </w:r>
+          </w:p>
+        </w:tc>
+      </w:tr>
+      <w:tr>
+        <w:tc>
+          <w:tcPr>
+            <w:tcW w:type="dxa" w:w="0"/>
+            <w:shd w:fill="FFFFFF" w:val="clear"/>
+            <w:tcMar>
+              <w:top w:type="dxa" w:w="80"/>
+              <w:left w:type="dxa" w:w="100"/>
+              <w:bottom w:type="dxa" w:w="80"/>
+              <w:right w:type="dxa" w:w="100"/>
+            </w:tcMar>
+          </w:tcPr>
+          <w:p>
+            <w:r>
+              <w:rPr>
+                <w:b w:val="false"/>
+                <w:bCs w:val="false"/>
+                <w:color w:val="222222"/>
+                <w:sz w:val="19"/>
+                <w:szCs w:val="19"/>
+              </w:rPr>
+              <w:t xml:space="preserve">Issuer-Ready value proposition erodes further as CSI adds more free features (it already added an enhanced format and calculators in 2025)</w:t>
+            </w:r>
+          </w:p>
+        </w:tc>
+        <w:tc>
+          <w:tcPr>
+            <w:tcW w:type="dxa" w:w="0"/>
+            <w:shd w:fill="FFFFFF" w:val="clear"/>
+            <w:tcMar>
+              <w:top w:type="dxa" w:w="80"/>
+              <w:left w:type="dxa" w:w="100"/>
+              <w:bottom w:type="dxa" w:w="80"/>
+              <w:right w:type="dxa" w:w="100"/>
+            </w:tcMar>
+          </w:tcPr>
+          <w:p>
+            <w:r>
+              <w:rPr>
+                <w:b w:val="false"/>
+                <w:bCs w:val="false"/>
+                <w:color w:val="222222"/>
+                <w:sz w:val="19"/>
+                <w:szCs w:val="19"/>
+              </w:rPr>
+              <w:t xml:space="preserve">High</w:t>
+            </w:r>
+          </w:p>
+        </w:tc>
+        <w:tc>
+          <w:tcPr>
+            <w:tcW w:type="dxa" w:w="0"/>
+            <w:shd w:fill="FFFFFF" w:val="clear"/>
+            <w:tcMar>
+              <w:top w:type="dxa" w:w="80"/>
+              <w:left w:type="dxa" w:w="100"/>
+              <w:bottom w:type="dxa" w:w="80"/>
+              <w:right w:type="dxa" w:w="100"/>
+            </w:tcMar>
+          </w:tcPr>
+          <w:p>
+            <w:r>
+              <w:rPr>
+                <w:b w:val="false"/>
+                <w:bCs w:val="false"/>
+                <w:color w:val="222222"/>
+                <w:sz w:val="19"/>
+                <w:szCs w:val="19"/>
+              </w:rPr>
+              <w:t xml:space="preserve">Validate the coordination-workflow value prop directly with a design-partner issuer before building; do not build features that risk direct CSI overlap (e.g. calculators)</w:t>
             </w:r>
           </w:p>
         </w:tc>
@@ -3620,6 +3947,24 @@
     </w:p>
     <w:p>
       <w:pPr>
+        <w:pStyle w:val="ListParagraph"/>
+        <w:numPr>
+          <w:ilvl w:val="0"/>
+          <w:numId w:val="3"/>
+        </w:numPr>
+        <w:spacing w:after="80" w:line="270"/>
+      </w:pPr>
+      <w:r>
+        <w:rPr>
+          <w:color w:val="222222"/>
+          <w:sz w:val="21"/>
+          <w:szCs w:val="21"/>
+        </w:rPr>
+        <w:t xml:space="preserve">For Issuer-Ready specifically: at least one design-partner issuer confirms the coordination workflow measurably reduces their internal CSI-prep time before broader Issuer-Ready development proceeds.</w:t>
+      </w:r>
+    </w:p>
+    <w:p>
+      <w:pPr>
         <w:pStyle w:val="Heading1"/>
         <w:spacing w:after="200" w:before="400"/>
       </w:pPr>
@@ -3644,7 +3989,7 @@
           <w:sz w:val="21"/>
           <w:szCs w:val="21"/>
         </w:rPr>
-        <w:t xml:space="preserve">This BRD is a working draft intended to guide PRD and SRS development. It should be revisited after pilot customer validation.</w:t>
+        <w:t xml:space="preserve">This BRD is a working draft intended to guide PRD and SRS development. It should be revisited after pilot customer validation, and again after any material change to CSI's own feature set.</w:t>
       </w:r>
     </w:p>
     <w:sectPr>
@@ -3797,7 +4142,7 @@
         <w:sz w:val="16"/>
         <w:szCs w:val="16"/>
       </w:rPr>
-      <w:t xml:space="preserve">BRD — SDG/ESG SME Platform</w:t>
+      <w:t xml:space="preserve">BRD — SDG/ESG Platform</w:t>
     </w:r>
   </w:p>
 </w:hdr>

</xml_diff>